<commit_message>
Fix attempt lifecycle and session restoration; align paper essay topics
</commit_message>
<xml_diff>
--- a/frontend/templates/Revision-Unit-7-Evolve-5-Essay-A5.docx
+++ b/frontend/templates/Revision-Unit-7-Evolve-5-Essay-A5.docx
@@ -4,19 +4,42 @@
   <w:body>
     <w:p>
       <w:r>
-        <w:t>EVOLVE 5 · UNIT 7 · ESSAY · about 250 words</w:t>
+        <w:t>EVOLVE 5 · UNIT 7 · ESSAY · choose ONE topic</w:t>
       </w:r>
     </w:p>
     <w:p>
       <w:r>
-        <w:t>Name: __________________________  Group: ______</w:t>
-        <w:br/>
-        <w:t>Date: ______________</w:t>
+        <w:t>Name: _______________________ Group: _____ Date: __________</w:t>
       </w:r>
     </w:p>
     <w:p>
       <w:r>
-        <w:t>Write an essay of about 250 words: Meaningful work matters more than a high salary. To what extent do you agree? Consider both perspectives, support your argument with an example, and give a reasoned conclusion. Use your own words. Do not copy the reading preview or task sentences.</w:t>
+        <w:t>Topic selected (1–4): _____</w:t>
+      </w:r>
+    </w:p>
+    <w:p>
+      <w:r>
+        <w:t>Choose ONE topic. Write about 250 words (recommended range: 225–275). Consider both perspectives, support your ideas with examples and give a reasoned conclusion. Use your own words. Do not use AI or copy task sentences or the reading preview. General or invented examples are welcome; personal disclosure is not required.</w:t>
+      </w:r>
+    </w:p>
+    <w:p>
+      <w:r>
+        <w:t>1. Meaningful work matters more than a high salary. To what extent do you agree?</w:t>
+      </w:r>
+    </w:p>
+    <w:p>
+      <w:r>
+        <w:t>2. Having more choices does not always make people happier. Discuss the advantages and disadvantages of a wide range of choices.</w:t>
+      </w:r>
+    </w:p>
+    <w:p>
+      <w:r>
+        <w:t>3. Companies should take responsibility for encouraging impulsive purchases. To what extent do you agree?</w:t>
+      </w:r>
+    </w:p>
+    <w:p>
+      <w:r>
+        <w:t>4. Paying people for small favours can damage relationships. Discuss both perspectives.</w:t>
       </w:r>
     </w:p>
     <w:p>
@@ -100,86 +123,6 @@
       </w:r>
     </w:p>
     <w:p>
-      <w:pPr>
-        <w:spacing w:after="0" w:line="320" w:lineRule="exact"/>
-      </w:pPr>
-      <w:r>
-        <w:t>_________________________________________________________________</w:t>
-      </w:r>
-    </w:p>
-    <w:p>
-      <w:pPr>
-        <w:spacing w:after="0" w:line="320" w:lineRule="exact"/>
-      </w:pPr>
-      <w:r>
-        <w:t>_________________________________________________________________</w:t>
-      </w:r>
-    </w:p>
-    <w:p>
-      <w:pPr>
-        <w:spacing w:after="0" w:line="320" w:lineRule="exact"/>
-      </w:pPr>
-      <w:r>
-        <w:t>_________________________________________________________________</w:t>
-      </w:r>
-    </w:p>
-    <w:p>
-      <w:pPr>
-        <w:spacing w:after="0" w:line="320" w:lineRule="exact"/>
-      </w:pPr>
-      <w:r>
-        <w:t>_________________________________________________________________</w:t>
-      </w:r>
-    </w:p>
-    <w:p>
-      <w:pPr>
-        <w:spacing w:after="0" w:line="320" w:lineRule="exact"/>
-      </w:pPr>
-      <w:r>
-        <w:t>_________________________________________________________________</w:t>
-      </w:r>
-    </w:p>
-    <w:p>
-      <w:pPr>
-        <w:spacing w:after="0" w:line="320" w:lineRule="exact"/>
-      </w:pPr>
-      <w:r>
-        <w:t>_________________________________________________________________</w:t>
-      </w:r>
-    </w:p>
-    <w:p>
-      <w:pPr>
-        <w:spacing w:after="0" w:line="320" w:lineRule="exact"/>
-      </w:pPr>
-      <w:r>
-        <w:t>_________________________________________________________________</w:t>
-      </w:r>
-    </w:p>
-    <w:p>
-      <w:pPr>
-        <w:spacing w:after="0" w:line="320" w:lineRule="exact"/>
-      </w:pPr>
-      <w:r>
-        <w:t>_________________________________________________________________</w:t>
-      </w:r>
-    </w:p>
-    <w:p>
-      <w:pPr>
-        <w:spacing w:after="0" w:line="320" w:lineRule="exact"/>
-      </w:pPr>
-      <w:r>
-        <w:t>_________________________________________________________________</w:t>
-      </w:r>
-    </w:p>
-    <w:p>
-      <w:pPr>
-        <w:spacing w:after="0" w:line="320" w:lineRule="exact"/>
-      </w:pPr>
-      <w:r>
-        <w:t>_________________________________________________________________</w:t>
-      </w:r>
-    </w:p>
-    <w:p>
       <w:r>
         <w:br w:type="page"/>
       </w:r>
@@ -191,15 +134,7 @@
     </w:p>
     <w:p>
       <w:r>
-        <w:t>Name: __________________________  Group: ______</w:t>
-      </w:r>
-    </w:p>
-    <w:p>
-      <w:pPr>
-        <w:spacing w:after="0" w:line="320" w:lineRule="exact"/>
-      </w:pPr>
-      <w:r>
-        <w:t>_________________________________________________________________</w:t>
+        <w:t>Name: _______________________ Group: _____</w:t>
       </w:r>
     </w:p>
     <w:p>

</xml_diff>